<commit_message>
pp-salygos: redakcinė korekcija W - „pateikia Sutarties įvykdymo užtikrinimą“ ir „užtikrinimui nurodyti“
ND, SSD, TSD SPS (LT ir LT/EN), MVP ir AK LT/EN SPS, sena TPS forma: perteklinis
„užtikrinimo“ ir AK LT/EN kablelis prieš „nurodyti“; 10 vietų, raudonas ir angliškas
tekstas nekeisti, žemėlapiai ir formu-versijos.json suderinti, pakartotinai - 0.

Co-Authored-By: Claude Opus 5.5 <noreply@anthropic.com>
</commit_message>
<xml_diff>
--- a/PP-salygos/templates/AK_LTEN_SPS.docx
+++ b/PP-salygos/templates/AK_LTEN_SPS.docx
@@ -42491,7 +42491,7 @@
                 <w:sz w:val="20"/>
                 <w:szCs w:val="20"/>
               </w:rPr>
-              <w:t xml:space="preserve"> Eur. Laimėjęs Tiekėjas pateikia Sutarties užtikrinimo įvykdymo užtikrinimą iki Sutarties sudarymo</w:t>
+              <w:t xml:space="preserve"> Eur. Laimėjęs Tiekėjas pateikia Sutarties įvykdymo užtikrinimą iki Sutarties sudarymo</w:t>
             </w:r>
             <w:r>
               <w:rPr>
@@ -42524,7 +42524,7 @@
                 <w:sz w:val="20"/>
                 <w:szCs w:val="20"/>
               </w:rPr>
-              <w:t xml:space="preserve">, nurodyti Sutarties projekto </w:t>
+              <w:t xml:space="preserve"> nurodyti Sutarties projekto </w:t>
             </w:r>
             <w:r>
               <w:rPr>

</xml_diff>

<commit_message>
pp-salygos: šablonų nuorodos į SPS priedus - to paties SPS priedų sąrašo numeriais (korekcija X)
Nuorodos į ūkio subjektų informacijos priedo priedėlius (kvazisubtiekėjo sutikimas, deklaracijos)
ir į formą „Konfidenciali informacija“ rodė ne savo sąrašo numerį: 23 vietos 10 SPS šablonų
(AK, AKV, MVP, ND, SSD LT ir LT/EN, TSD LT). Žemėlapių tekstas ir raudoni fragmentai suderinti,
formu-versijos.json sugeneruotas iš naujo; pakartotinai - 0 pakeitimų.

Co-Authored-By: Claude Opus 5.5 <noreply@anthropic.com>
</commit_message>
<xml_diff>
--- a/PP-salygos/templates/AK_LTEN_SPS.docx
+++ b/PP-salygos/templates/AK_LTEN_SPS.docx
@@ -37387,7 +37387,7 @@
                 <w:sz w:val="20"/>
                 <w:szCs w:val="20"/>
               </w:rPr>
-              <w:t xml:space="preserve">SPS 6 priedo </w:t>
+              <w:t xml:space="preserve">SPS 5 priedo </w:t>
             </w:r>
             <w:r>
               <w:rPr>
@@ -37582,7 +37582,7 @@
                 <w:szCs w:val="20"/>
                 <w:lang w:val="en-US"/>
               </w:rPr>
-              <w:t>Annex 6 to the SPC</w:t>
+              <w:t>Annex 5 to the SPC</w:t>
             </w:r>
             <w:r>
               <w:rPr>

</xml_diff>